<commit_message>
modification du fichier exercice
</commit_message>
<xml_diff>
--- a/exercice.docx
+++ b/exercice.docx
@@ -31,6 +31,15 @@
         </w:rPr>
         <w:t xml:space="preserve"> – durée 2h</w:t>
       </w:r>
+      <w:r>
+        <w:rPr>
+          <w:rFonts w:ascii="Garamond" w:hAnsi="Garamond"/>
+          <w:b/>
+          <w:sz w:val="32"/>
+          <w:szCs w:val="32"/>
+        </w:rPr>
+        <w:t xml:space="preserve">       </w:t>
+      </w:r>
     </w:p>
     <w:p>
       <w:pPr>
@@ -2917,14 +2926,7 @@
           <w:sz w:val="20"/>
           <w:szCs w:val="20"/>
         </w:rPr>
-        <w:t xml:space="preserve">s </w:t>
-      </w:r>
-      <w:r>
-        <w:rPr>
-          <w:sz w:val="20"/>
-          <w:szCs w:val="20"/>
-        </w:rPr>
-        <w:t>de chaque client</w:t>
+        <w:t>s de chaque client</w:t>
       </w:r>
       <w:r>
         <w:rPr>
@@ -3165,14 +3167,7 @@
           <w:sz w:val="20"/>
           <w:szCs w:val="20"/>
         </w:rPr>
-        <w:t xml:space="preserve"> dont la </w:t>
-      </w:r>
-      <w:r>
-        <w:rPr>
-          <w:sz w:val="20"/>
-          <w:szCs w:val="20"/>
-        </w:rPr>
-        <w:t>quantité totale</w:t>
+        <w:t xml:space="preserve"> dont la quantité totale</w:t>
       </w:r>
       <w:r>
         <w:rPr>

</xml_diff>